<commit_message>
NSFR: milliy hisobot va MHXS 9 farqi bo‘limi va shartli misol jadvali
Co-Authored-By: Claude Opus 5.5 <noreply@anthropic.com>
Claude-Session: https://claude.ai/code/session_01PxHTC8Q7yHdrpAeUA5KUgM
</commit_message>
<xml_diff>
--- a/paragraflar/NSFR.docx
+++ b/paragraflar/NSFR.docx
@@ -2,7 +2,7 @@
 <file path=word/document.xml><?xml version="1.0" encoding="utf-8"?>
 <w:document xmlns:w="http://schemas.openxmlformats.org/wordprocessingml/2006/main" xmlns:m="http://schemas.openxmlformats.org/officeDocument/2006/math" xmlns:r="http://schemas.openxmlformats.org/officeDocument/2006/relationships" xmlns:o="urn:schemas-microsoft-com:office:office" xmlns:v="urn:schemas-microsoft-com:vml" xmlns:w10="urn:schemas-microsoft-com:office:word" xmlns:a="http://schemas.openxmlformats.org/drawingml/2006/main" xmlns:pic="http://schemas.openxmlformats.org/drawingml/2006/picture" xmlns:wp="http://schemas.openxmlformats.org/drawingml/2006/wordprocessingDrawing">
   <w:body>
-    <w:bookmarkStart w:id="32" w:name="X180e931d57e7008ce6bbf5ed0d8c855553f00ac"/>
+    <w:bookmarkStart w:id="35" w:name="X180e931d57e7008ce6bbf5ed0d8c855553f00ac"/>
     <w:p>
       <w:pPr>
         <w:pStyle w:val="Heading2"/>
@@ -2622,7 +2622,771 @@
         <w:t xml:space="preserve">. Bu yondashuv bilan qo‘shilgan holda ta’kidlash lozimki, moliyaviy barqarorlikni integral baholashda sof barqaror moliyalashtirish me’yori likvidlik blokining tarkibiy qismi sifatida, likvidlikni qoplash koeffitsiyenti bilan bir qatorda hisobga olinishi kerak. Chunki faqat qisqa muddatli likvidlikni baholash bankning moliyalashtirish tuzilmasidagi chuqurroq nomutanosiblikni ko‘rmay qolishi mumkin.</w:t>
       </w:r>
     </w:p>
-    <w:bookmarkEnd w:id="32"/>
+    <w:p>
+      <w:pPr>
+        <w:pStyle w:val="BodyText"/>
+        <w:spacing w:line="360" w:lineRule="auto" w:before="0" w:after="0"/>
+        <w:ind w:firstLine="709"/>
+        <w:jc w:val="both"/>
+      </w:pPr>
+      <w:r>
+        <w:rPr>
+          <w:rFonts w:ascii="Times New Roman" w:hAnsi="Times New Roman" w:cs="Times New Roman" w:eastAsia="Times New Roman"/>
+          <w:sz w:val="28"/>
+        </w:rPr>
+        <w:t xml:space="preserve">Sof barqaror moliyalashtirish me’yorini hisoblashda yana bir muhim masala – milliy hisobot va MHXS 9 ma’lumotlari o‘rtasidagi farq. Me’yorning formulasi va koeffitsiyentlari buxgalteriya standartiga bog‘liq emas, ular Bazel standarti va Markaziy bank nizomi bilan belgilanadi. Biroq hisob-kitobga kiritiladigan summalar va ularning tasnifi aynan buxgalteriya hisobidan olinadi, shu sababli natija qaysi hisobot asosida hisoblanganiga qarab farq qiladi. Bu farq asosan besh yo‘nalishda yuzaga keladi: birinchidan, MHXS 9 bo‘yicha kutilgan kredit zararlari uchun shakllantiriladigan zaxiralar odatda kattaroq bo‘lib, ular bir vaqtning o‘zida kapitalni, ya’ni mavjud barqaror moliyalashtirishni va kreditlarning sof qiymatini, ya’ni talab qilinadigan barqaror moliyalashtirishni kamaytiradi; ikkinchidan, muammoli kreditlar ta’rifi farq qiladi, MHXS 9 dagi 3-bosqich bilan milliy tasnifdagi toifalar mos kelmaydi, bunda muammoli deb topilgan kredit uchun koeffitsiyent 85 foizdan 100 foizga oshadi; uchinchidan, qimmatli qog‘ozlar amortizatsiya qilingan yoki haqqoniy qiymatda turlicha baholanadi; to‘rtinchidan, MHXS hisoboti odatda bank guruhi bo‘yicha konsolidatsiyalangan bo‘ladi; beshinchidan, MHXS 9 bo‘yicha balansdan tashqari majburiyatlar uchun ham zaxira yaratiladi. Ushbu farqlarning me’yorga ta’siri shartli misolda 2-jadvalda ko‘rsatildi.</w:t>
+      </w:r>
+    </w:p>
+    <w:p>
+      <w:pPr>
+        <w:pStyle w:val="BodyText"/>
+        <w:keepNext/>
+        <w:spacing w:line="360" w:lineRule="auto" w:before="120" w:after="0"/>
+        <w:ind w:firstLine="0"/>
+        <w:jc w:val="right"/>
+      </w:pPr>
+      <w:r>
+        <w:rPr>
+          <w:rFonts w:ascii="Times New Roman" w:hAnsi="Times New Roman" w:cs="Times New Roman" w:eastAsia="Times New Roman"/>
+          <w:i/>
+          <w:sz w:val="28"/>
+        </w:rPr>
+        <w:t xml:space="preserve">2-jadval</w:t>
+      </w:r>
+    </w:p>
+    <w:p>
+      <w:pPr>
+        <w:pStyle w:val="BodyText"/>
+        <w:keepNext/>
+        <w:spacing w:line="240" w:lineRule="auto" w:before="0" w:after="120"/>
+        <w:ind w:firstLine="0"/>
+        <w:jc w:val="center"/>
+      </w:pPr>
+      <w:r>
+        <w:rPr>
+          <w:bCs/>
+          <w:rFonts w:ascii="Times New Roman" w:hAnsi="Times New Roman" w:cs="Times New Roman" w:eastAsia="Times New Roman"/>
+          <w:b/>
+          <w:sz w:val="28"/>
+        </w:rPr>
+        <w:t xml:space="preserve">Milliy hisobot va MHXS 9 asosida sof barqaror moliyalashtirish me’yorini hisoblash (shartli misol)</w:t>
+      </w:r>
+      <w:r>
+        <w:rPr>
+          <w:rStyle w:val="FootnoteReference"/>
+        </w:rPr>
+        <w:footnoteReference w:id="32"/>
+      </w:r>
+    </w:p>
+    <w:tbl>
+      <w:tblPr>
+        <w:tblStyle w:val="Table"/>
+        <w:tblW w:type="pct" w:w="5000"/>
+        <w:tblLook w:firstRow="1" w:lastRow="0" w:firstColumn="0" w:lastColumn="0" w:noHBand="0" w:noVBand="0" w:val="0020"/>
+        <w:jc w:val="start"/>
+        <w:tblBorders>
+          <w:top w:val="single" w:sz="4" w:color="000000"/>
+          <w:left w:val="single" w:sz="4" w:color="000000"/>
+          <w:bottom w:val="single" w:sz="4" w:color="000000"/>
+          <w:right w:val="single" w:sz="4" w:color="000000"/>
+          <w:insideH w:val="single" w:sz="4" w:color="000000"/>
+          <w:insideV w:val="single" w:sz="4" w:color="000000"/>
+        </w:tblBorders>
+      </w:tblPr>
+      <w:tblGrid>
+        <w:gridCol w:w="1980"/>
+        <w:gridCol w:w="1980"/>
+        <w:gridCol w:w="1980"/>
+        <w:gridCol w:w="1980"/>
+      </w:tblGrid>
+      <w:tr>
+        <w:trPr>
+          <w:tblHeader w:val="true"/>
+          <w:cantSplit/>
+          <w:tblHeader/>
+        </w:trPr>
+        <w:tc>
+          <w:tcPr>
+            <w:shd w:val="clear" w:color="auto" w:fill="DEEBF7"/>
+          </w:tcPr>
+          <w:p>
+            <w:pPr>
+              <w:pStyle w:val="Compact"/>
+              <w:spacing w:line="240" w:lineRule="auto"/>
+              <w:ind w:firstLine="0"/>
+              <w:jc w:val="center"/>
+            </w:pPr>
+            <w:r>
+              <w:rPr>
+                <w:rFonts w:ascii="Times New Roman" w:hAnsi="Times New Roman" w:cs="Times New Roman" w:eastAsia="Times New Roman"/>
+                <w:b/>
+                <w:sz w:val="22"/>
+              </w:rPr>
+              <w:t xml:space="preserve">Ko‘rsatkich</w:t>
+            </w:r>
+          </w:p>
+        </w:tc>
+        <w:tc>
+          <w:tcPr>
+            <w:shd w:val="clear" w:color="auto" w:fill="DEEBF7"/>
+          </w:tcPr>
+          <w:p>
+            <w:pPr>
+              <w:pStyle w:val="Compact"/>
+              <w:spacing w:line="240" w:lineRule="auto"/>
+              <w:ind w:firstLine="0"/>
+              <w:jc w:val="center"/>
+            </w:pPr>
+            <w:r>
+              <w:rPr>
+                <w:rFonts w:ascii="Times New Roman" w:hAnsi="Times New Roman" w:cs="Times New Roman" w:eastAsia="Times New Roman"/>
+                <w:b/>
+                <w:sz w:val="22"/>
+              </w:rPr>
+              <w:t xml:space="preserve">Milliy hisobot</w:t>
+            </w:r>
+          </w:p>
+        </w:tc>
+        <w:tc>
+          <w:tcPr>
+            <w:shd w:val="clear" w:color="auto" w:fill="DEEBF7"/>
+          </w:tcPr>
+          <w:p>
+            <w:pPr>
+              <w:pStyle w:val="Compact"/>
+              <w:spacing w:line="240" w:lineRule="auto"/>
+              <w:ind w:firstLine="0"/>
+              <w:jc w:val="center"/>
+            </w:pPr>
+            <w:r>
+              <w:rPr>
+                <w:rFonts w:ascii="Times New Roman" w:hAnsi="Times New Roman" w:cs="Times New Roman" w:eastAsia="Times New Roman"/>
+                <w:b/>
+                <w:sz w:val="22"/>
+              </w:rPr>
+              <w:t xml:space="preserve">MHXS 9: qo‘shimcha zaxira</w:t>
+            </w:r>
+          </w:p>
+        </w:tc>
+        <w:tc>
+          <w:tcPr>
+            <w:shd w:val="clear" w:color="auto" w:fill="DEEBF7"/>
+          </w:tcPr>
+          <w:p>
+            <w:pPr>
+              <w:pStyle w:val="Compact"/>
+              <w:spacing w:line="240" w:lineRule="auto"/>
+              <w:ind w:firstLine="0"/>
+              <w:jc w:val="center"/>
+            </w:pPr>
+            <w:r>
+              <w:rPr>
+                <w:rFonts w:ascii="Times New Roman" w:hAnsi="Times New Roman" w:cs="Times New Roman" w:eastAsia="Times New Roman"/>
+                <w:b/>
+                <w:sz w:val="22"/>
+              </w:rPr>
+              <w:t xml:space="preserve">MHXS 9: zaxira va muammoli kreditlar tasnifi</w:t>
+            </w:r>
+          </w:p>
+        </w:tc>
+      </w:tr>
+      <w:tr>
+        <w:trPr>
+          <w:cantSplit/>
+        </w:trPr>
+        <w:tc>
+          <w:tcPr/>
+          <w:p>
+            <w:pPr>
+              <w:pStyle w:val="Compact"/>
+              <w:spacing w:line="240" w:lineRule="auto"/>
+              <w:ind w:firstLine="0"/>
+              <w:jc w:val="left"/>
+            </w:pPr>
+            <w:r>
+              <w:rPr>
+                <w:rFonts w:ascii="Times New Roman" w:hAnsi="Times New Roman" w:cs="Times New Roman" w:eastAsia="Times New Roman"/>
+                <w:sz w:val="22"/>
+              </w:rPr>
+              <w:t xml:space="preserve">Kapital</w:t>
+            </w:r>
+          </w:p>
+        </w:tc>
+        <w:tc>
+          <w:tcPr/>
+          <w:p>
+            <w:pPr>
+              <w:pStyle w:val="Compact"/>
+              <w:spacing w:line="240" w:lineRule="auto"/>
+              <w:ind w:firstLine="0"/>
+              <w:jc w:val="left"/>
+            </w:pPr>
+            <w:r>
+              <w:rPr>
+                <w:rFonts w:ascii="Times New Roman" w:hAnsi="Times New Roman" w:cs="Times New Roman" w:eastAsia="Times New Roman"/>
+                <w:sz w:val="22"/>
+              </w:rPr>
+              <w:t xml:space="preserve">150</w:t>
+            </w:r>
+          </w:p>
+        </w:tc>
+        <w:tc>
+          <w:tcPr/>
+          <w:p>
+            <w:pPr>
+              <w:pStyle w:val="Compact"/>
+              <w:spacing w:line="240" w:lineRule="auto"/>
+              <w:ind w:firstLine="0"/>
+              <w:jc w:val="left"/>
+            </w:pPr>
+            <w:r>
+              <w:rPr>
+                <w:rFonts w:ascii="Times New Roman" w:hAnsi="Times New Roman" w:cs="Times New Roman" w:eastAsia="Times New Roman"/>
+                <w:sz w:val="22"/>
+              </w:rPr>
+              <w:t xml:space="preserve">110</w:t>
+            </w:r>
+          </w:p>
+        </w:tc>
+        <w:tc>
+          <w:tcPr/>
+          <w:p>
+            <w:pPr>
+              <w:pStyle w:val="Compact"/>
+              <w:spacing w:line="240" w:lineRule="auto"/>
+              <w:ind w:firstLine="0"/>
+              <w:jc w:val="left"/>
+            </w:pPr>
+            <w:r>
+              <w:rPr>
+                <w:rFonts w:ascii="Times New Roman" w:hAnsi="Times New Roman" w:cs="Times New Roman" w:eastAsia="Times New Roman"/>
+                <w:sz w:val="22"/>
+              </w:rPr>
+              <w:t xml:space="preserve">110</w:t>
+            </w:r>
+          </w:p>
+        </w:tc>
+      </w:tr>
+      <w:tr>
+        <w:trPr>
+          <w:cantSplit/>
+        </w:trPr>
+        <w:tc>
+          <w:tcPr/>
+          <w:p>
+            <w:pPr>
+              <w:pStyle w:val="Compact"/>
+              <w:spacing w:line="240" w:lineRule="auto"/>
+              <w:ind w:firstLine="0"/>
+              <w:jc w:val="left"/>
+            </w:pPr>
+            <w:r>
+              <w:rPr>
+                <w:rFonts w:ascii="Times New Roman" w:hAnsi="Times New Roman" w:cs="Times New Roman" w:eastAsia="Times New Roman"/>
+                <w:sz w:val="22"/>
+              </w:rPr>
+              <w:t xml:space="preserve">Ishlaydigan kreditlar (sof)</w:t>
+            </w:r>
+          </w:p>
+        </w:tc>
+        <w:tc>
+          <w:tcPr/>
+          <w:p>
+            <w:pPr>
+              <w:pStyle w:val="Compact"/>
+              <w:spacing w:line="240" w:lineRule="auto"/>
+              <w:ind w:firstLine="0"/>
+              <w:jc w:val="left"/>
+            </w:pPr>
+            <w:r>
+              <w:rPr>
+                <w:rFonts w:ascii="Times New Roman" w:hAnsi="Times New Roman" w:cs="Times New Roman" w:eastAsia="Times New Roman"/>
+                <w:sz w:val="22"/>
+              </w:rPr>
+              <w:t xml:space="preserve">800</w:t>
+            </w:r>
+          </w:p>
+        </w:tc>
+        <w:tc>
+          <w:tcPr/>
+          <w:p>
+            <w:pPr>
+              <w:pStyle w:val="Compact"/>
+              <w:spacing w:line="240" w:lineRule="auto"/>
+              <w:ind w:firstLine="0"/>
+              <w:jc w:val="left"/>
+            </w:pPr>
+            <w:r>
+              <w:rPr>
+                <w:rFonts w:ascii="Times New Roman" w:hAnsi="Times New Roman" w:cs="Times New Roman" w:eastAsia="Times New Roman"/>
+                <w:sz w:val="22"/>
+              </w:rPr>
+              <w:t xml:space="preserve">780</w:t>
+            </w:r>
+          </w:p>
+        </w:tc>
+        <w:tc>
+          <w:tcPr/>
+          <w:p>
+            <w:pPr>
+              <w:pStyle w:val="Compact"/>
+              <w:spacing w:line="240" w:lineRule="auto"/>
+              <w:ind w:firstLine="0"/>
+              <w:jc w:val="left"/>
+            </w:pPr>
+            <w:r>
+              <w:rPr>
+                <w:rFonts w:ascii="Times New Roman" w:hAnsi="Times New Roman" w:cs="Times New Roman" w:eastAsia="Times New Roman"/>
+                <w:sz w:val="22"/>
+              </w:rPr>
+              <w:t xml:space="preserve">720</w:t>
+            </w:r>
+          </w:p>
+        </w:tc>
+      </w:tr>
+      <w:tr>
+        <w:trPr>
+          <w:cantSplit/>
+        </w:trPr>
+        <w:tc>
+          <w:tcPr/>
+          <w:p>
+            <w:pPr>
+              <w:pStyle w:val="Compact"/>
+              <w:spacing w:line="240" w:lineRule="auto"/>
+              <w:ind w:firstLine="0"/>
+              <w:jc w:val="left"/>
+            </w:pPr>
+            <w:r>
+              <w:rPr>
+                <w:rFonts w:ascii="Times New Roman" w:hAnsi="Times New Roman" w:cs="Times New Roman" w:eastAsia="Times New Roman"/>
+                <w:sz w:val="22"/>
+              </w:rPr>
+              <w:t xml:space="preserve">Muammoli kreditlar (sof)</w:t>
+            </w:r>
+          </w:p>
+        </w:tc>
+        <w:tc>
+          <w:tcPr/>
+          <w:p>
+            <w:pPr>
+              <w:pStyle w:val="Compact"/>
+              <w:spacing w:line="240" w:lineRule="auto"/>
+              <w:ind w:firstLine="0"/>
+              <w:jc w:val="left"/>
+            </w:pPr>
+            <w:r>
+              <w:rPr>
+                <w:rFonts w:ascii="Times New Roman" w:hAnsi="Times New Roman" w:cs="Times New Roman" w:eastAsia="Times New Roman"/>
+                <w:sz w:val="22"/>
+              </w:rPr>
+              <w:t xml:space="preserve">50</w:t>
+            </w:r>
+          </w:p>
+        </w:tc>
+        <w:tc>
+          <w:tcPr/>
+          <w:p>
+            <w:pPr>
+              <w:pStyle w:val="Compact"/>
+              <w:spacing w:line="240" w:lineRule="auto"/>
+              <w:ind w:firstLine="0"/>
+              <w:jc w:val="left"/>
+            </w:pPr>
+            <w:r>
+              <w:rPr>
+                <w:rFonts w:ascii="Times New Roman" w:hAnsi="Times New Roman" w:cs="Times New Roman" w:eastAsia="Times New Roman"/>
+                <w:sz w:val="22"/>
+              </w:rPr>
+              <w:t xml:space="preserve">30</w:t>
+            </w:r>
+          </w:p>
+        </w:tc>
+        <w:tc>
+          <w:tcPr/>
+          <w:p>
+            <w:pPr>
+              <w:pStyle w:val="Compact"/>
+              <w:spacing w:line="240" w:lineRule="auto"/>
+              <w:ind w:firstLine="0"/>
+              <w:jc w:val="left"/>
+            </w:pPr>
+            <w:r>
+              <w:rPr>
+                <w:rFonts w:ascii="Times New Roman" w:hAnsi="Times New Roman" w:cs="Times New Roman" w:eastAsia="Times New Roman"/>
+                <w:sz w:val="22"/>
+              </w:rPr>
+              <w:t xml:space="preserve">90</w:t>
+            </w:r>
+          </w:p>
+        </w:tc>
+      </w:tr>
+      <w:tr>
+        <w:trPr>
+          <w:cantSplit/>
+        </w:trPr>
+        <w:tc>
+          <w:tcPr/>
+          <w:p>
+            <w:pPr>
+              <w:pStyle w:val="Compact"/>
+              <w:spacing w:line="240" w:lineRule="auto"/>
+              <w:ind w:firstLine="0"/>
+              <w:jc w:val="left"/>
+            </w:pPr>
+            <w:r>
+              <w:rPr>
+                <w:rFonts w:ascii="Times New Roman" w:hAnsi="Times New Roman" w:cs="Times New Roman" w:eastAsia="Times New Roman"/>
+                <w:sz w:val="22"/>
+              </w:rPr>
+              <w:t xml:space="preserve">Mavjud barqaror moliyalashtirish (ASF)</w:t>
+            </w:r>
+          </w:p>
+        </w:tc>
+        <w:tc>
+          <w:tcPr/>
+          <w:p>
+            <w:pPr>
+              <w:pStyle w:val="Compact"/>
+              <w:spacing w:line="240" w:lineRule="auto"/>
+              <w:ind w:firstLine="0"/>
+              <w:jc w:val="left"/>
+            </w:pPr>
+            <w:r>
+              <w:rPr>
+                <w:rFonts w:ascii="Times New Roman" w:hAnsi="Times New Roman" w:cs="Times New Roman" w:eastAsia="Times New Roman"/>
+                <w:sz w:val="22"/>
+              </w:rPr>
+              <w:t xml:space="preserve">840</w:t>
+            </w:r>
+          </w:p>
+        </w:tc>
+        <w:tc>
+          <w:tcPr/>
+          <w:p>
+            <w:pPr>
+              <w:pStyle w:val="Compact"/>
+              <w:spacing w:line="240" w:lineRule="auto"/>
+              <w:ind w:firstLine="0"/>
+              <w:jc w:val="left"/>
+            </w:pPr>
+            <w:r>
+              <w:rPr>
+                <w:rFonts w:ascii="Times New Roman" w:hAnsi="Times New Roman" w:cs="Times New Roman" w:eastAsia="Times New Roman"/>
+                <w:sz w:val="22"/>
+              </w:rPr>
+              <w:t xml:space="preserve">800</w:t>
+            </w:r>
+          </w:p>
+        </w:tc>
+        <w:tc>
+          <w:tcPr/>
+          <w:p>
+            <w:pPr>
+              <w:pStyle w:val="Compact"/>
+              <w:spacing w:line="240" w:lineRule="auto"/>
+              <w:ind w:firstLine="0"/>
+              <w:jc w:val="left"/>
+            </w:pPr>
+            <w:r>
+              <w:rPr>
+                <w:rFonts w:ascii="Times New Roman" w:hAnsi="Times New Roman" w:cs="Times New Roman" w:eastAsia="Times New Roman"/>
+                <w:sz w:val="22"/>
+              </w:rPr>
+              <w:t xml:space="preserve">800</w:t>
+            </w:r>
+          </w:p>
+        </w:tc>
+      </w:tr>
+      <w:tr>
+        <w:trPr>
+          <w:cantSplit/>
+        </w:trPr>
+        <w:tc>
+          <w:tcPr/>
+          <w:p>
+            <w:pPr>
+              <w:pStyle w:val="Compact"/>
+              <w:spacing w:line="240" w:lineRule="auto"/>
+              <w:ind w:firstLine="0"/>
+              <w:jc w:val="left"/>
+            </w:pPr>
+            <w:r>
+              <w:rPr>
+                <w:rFonts w:ascii="Times New Roman" w:hAnsi="Times New Roman" w:cs="Times New Roman" w:eastAsia="Times New Roman"/>
+                <w:sz w:val="22"/>
+              </w:rPr>
+              <w:t xml:space="preserve">Talab qilinadigan barqaror moliyalashtirish (RSF)</w:t>
+            </w:r>
+          </w:p>
+        </w:tc>
+        <w:tc>
+          <w:tcPr/>
+          <w:p>
+            <w:pPr>
+              <w:pStyle w:val="Compact"/>
+              <w:spacing w:line="240" w:lineRule="auto"/>
+              <w:ind w:firstLine="0"/>
+              <w:jc w:val="left"/>
+            </w:pPr>
+            <w:r>
+              <w:rPr>
+                <w:rFonts w:ascii="Times New Roman" w:hAnsi="Times New Roman" w:cs="Times New Roman" w:eastAsia="Times New Roman"/>
+                <w:sz w:val="22"/>
+              </w:rPr>
+              <w:t xml:space="preserve">735</w:t>
+            </w:r>
+          </w:p>
+        </w:tc>
+        <w:tc>
+          <w:tcPr/>
+          <w:p>
+            <w:pPr>
+              <w:pStyle w:val="Compact"/>
+              <w:spacing w:line="240" w:lineRule="auto"/>
+              <w:ind w:firstLine="0"/>
+              <w:jc w:val="left"/>
+            </w:pPr>
+            <w:r>
+              <w:rPr>
+                <w:rFonts w:ascii="Times New Roman" w:hAnsi="Times New Roman" w:cs="Times New Roman" w:eastAsia="Times New Roman"/>
+                <w:sz w:val="22"/>
+              </w:rPr>
+              <w:t xml:space="preserve">698</w:t>
+            </w:r>
+          </w:p>
+        </w:tc>
+        <w:tc>
+          <w:tcPr/>
+          <w:p>
+            <w:pPr>
+              <w:pStyle w:val="Compact"/>
+              <w:spacing w:line="240" w:lineRule="auto"/>
+              <w:ind w:firstLine="0"/>
+              <w:jc w:val="left"/>
+            </w:pPr>
+            <w:r>
+              <w:rPr>
+                <w:rFonts w:ascii="Times New Roman" w:hAnsi="Times New Roman" w:cs="Times New Roman" w:eastAsia="Times New Roman"/>
+                <w:sz w:val="22"/>
+              </w:rPr>
+              <w:t xml:space="preserve">707</w:t>
+            </w:r>
+          </w:p>
+        </w:tc>
+      </w:tr>
+      <w:tr>
+        <w:trPr>
+          <w:cantSplit/>
+        </w:trPr>
+        <w:tc>
+          <w:tcPr/>
+          <w:p>
+            <w:pPr>
+              <w:pStyle w:val="Compact"/>
+              <w:spacing w:line="240" w:lineRule="auto"/>
+              <w:ind w:firstLine="0"/>
+              <w:jc w:val="left"/>
+            </w:pPr>
+            <w:r>
+              <w:rPr>
+                <w:rFonts w:ascii="Times New Roman" w:hAnsi="Times New Roman" w:cs="Times New Roman" w:eastAsia="Times New Roman"/>
+                <w:sz w:val="22"/>
+              </w:rPr>
+              <w:t xml:space="preserve">Sof barqaror moliyalashtirish me’yori, %</w:t>
+            </w:r>
+          </w:p>
+        </w:tc>
+        <w:tc>
+          <w:tcPr/>
+          <w:p>
+            <w:pPr>
+              <w:pStyle w:val="Compact"/>
+              <w:spacing w:line="240" w:lineRule="auto"/>
+              <w:ind w:firstLine="0"/>
+              <w:jc w:val="left"/>
+            </w:pPr>
+            <w:r>
+              <w:rPr>
+                <w:rFonts w:ascii="Times New Roman" w:hAnsi="Times New Roman" w:cs="Times New Roman" w:eastAsia="Times New Roman"/>
+                <w:sz w:val="22"/>
+              </w:rPr>
+              <w:t xml:space="preserve">114,3</w:t>
+            </w:r>
+          </w:p>
+        </w:tc>
+        <w:tc>
+          <w:tcPr/>
+          <w:p>
+            <w:pPr>
+              <w:pStyle w:val="Compact"/>
+              <w:spacing w:line="240" w:lineRule="auto"/>
+              <w:ind w:firstLine="0"/>
+              <w:jc w:val="left"/>
+            </w:pPr>
+            <w:r>
+              <w:rPr>
+                <w:rFonts w:ascii="Times New Roman" w:hAnsi="Times New Roman" w:cs="Times New Roman" w:eastAsia="Times New Roman"/>
+                <w:sz w:val="22"/>
+              </w:rPr>
+              <w:t xml:space="preserve">114,6</w:t>
+            </w:r>
+          </w:p>
+        </w:tc>
+        <w:tc>
+          <w:tcPr/>
+          <w:p>
+            <w:pPr>
+              <w:pStyle w:val="Compact"/>
+              <w:spacing w:line="240" w:lineRule="auto"/>
+              <w:ind w:firstLine="0"/>
+              <w:jc w:val="left"/>
+            </w:pPr>
+            <w:r>
+              <w:rPr>
+                <w:rFonts w:ascii="Times New Roman" w:hAnsi="Times New Roman" w:cs="Times New Roman" w:eastAsia="Times New Roman"/>
+                <w:sz w:val="22"/>
+              </w:rPr>
+              <w:t xml:space="preserve">113,2</w:t>
+            </w:r>
+          </w:p>
+        </w:tc>
+      </w:tr>
+      <w:tr>
+        <w:trPr>
+          <w:cantSplit/>
+        </w:trPr>
+        <w:tc>
+          <w:tcPr/>
+          <w:p>
+            <w:pPr>
+              <w:pStyle w:val="Compact"/>
+              <w:spacing w:line="240" w:lineRule="auto"/>
+              <w:ind w:firstLine="0"/>
+              <w:jc w:val="left"/>
+            </w:pPr>
+            <w:r>
+              <w:rPr>
+                <w:rFonts w:ascii="Times New Roman" w:hAnsi="Times New Roman" w:cs="Times New Roman" w:eastAsia="Times New Roman"/>
+                <w:sz w:val="22"/>
+              </w:rPr>
+              <w:t xml:space="preserve">Kapitalning o‘zgarishi, %</w:t>
+            </w:r>
+          </w:p>
+        </w:tc>
+        <w:tc>
+          <w:tcPr/>
+          <w:p>
+            <w:pPr>
+              <w:pStyle w:val="Compact"/>
+              <w:spacing w:line="240" w:lineRule="auto"/>
+              <w:ind w:firstLine="0"/>
+              <w:jc w:val="left"/>
+            </w:pPr>
+            <w:r>
+              <w:rPr>
+                <w:rFonts w:ascii="Times New Roman" w:hAnsi="Times New Roman" w:cs="Times New Roman" w:eastAsia="Times New Roman"/>
+                <w:sz w:val="22"/>
+              </w:rPr>
+              <w:t xml:space="preserve">–</w:t>
+            </w:r>
+          </w:p>
+        </w:tc>
+        <w:tc>
+          <w:tcPr/>
+          <w:p>
+            <w:pPr>
+              <w:pStyle w:val="Compact"/>
+              <w:spacing w:line="240" w:lineRule="auto"/>
+              <w:ind w:firstLine="0"/>
+              <w:jc w:val="left"/>
+            </w:pPr>
+            <w:r>
+              <w:rPr>
+                <w:rFonts w:ascii="Times New Roman" w:hAnsi="Times New Roman" w:cs="Times New Roman" w:eastAsia="Times New Roman"/>
+                <w:sz w:val="22"/>
+              </w:rPr>
+              <w:t xml:space="preserve">−26,7</w:t>
+            </w:r>
+          </w:p>
+        </w:tc>
+        <w:tc>
+          <w:tcPr/>
+          <w:p>
+            <w:pPr>
+              <w:pStyle w:val="Compact"/>
+              <w:spacing w:line="240" w:lineRule="auto"/>
+              <w:ind w:firstLine="0"/>
+              <w:jc w:val="left"/>
+            </w:pPr>
+            <w:r>
+              <w:rPr>
+                <w:rFonts w:ascii="Times New Roman" w:hAnsi="Times New Roman" w:cs="Times New Roman" w:eastAsia="Times New Roman"/>
+                <w:sz w:val="22"/>
+              </w:rPr>
+              <w:t xml:space="preserve">−26,7</w:t>
+            </w:r>
+          </w:p>
+        </w:tc>
+      </w:tr>
+    </w:tbl>
+    <w:p>
+      <w:pPr>
+        <w:pStyle w:val="BodyText"/>
+        <w:spacing w:line="360" w:lineRule="auto" w:before="0" w:after="0"/>
+        <w:ind w:firstLine="709"/>
+        <w:jc w:val="both"/>
+      </w:pPr>
+      <w:r>
+        <w:rPr>
+          <w:rFonts w:ascii="Times New Roman" w:hAnsi="Times New Roman" w:cs="Times New Roman" w:eastAsia="Times New Roman"/>
+          <w:sz w:val="28"/>
+        </w:rPr>
+        <w:t xml:space="preserve">Jadval ma’lumotlari shuni ko‘rsatadiki, MHXS 9 bo‘yicha qo‘shimcha 40 birlik zaxira kapitalni 26,7 foizga kamaytirsa-da, me’yor deyarli o‘zgarmaydi, chunki zaxira suratni ham, maxrajni ham kamaytiradi va ularning ta’siri qisman bir-birini qoplaydi. Me’yorga sezilarli salbiy ta’sir esa muammoli kreditlar ta’rifi kengayib, 60 birlik kredit muammoli toifaga o‘tkazilganda yuzaga keladi va u 1,1 foiz punktga pasayadi.</w:t>
+      </w:r>
+    </w:p>
+    <w:p>
+      <w:pPr>
+        <w:pStyle w:val="BodyText"/>
+        <w:spacing w:line="360" w:lineRule="auto" w:before="0" w:after="0"/>
+        <w:ind w:firstLine="709"/>
+        <w:jc w:val="both"/>
+      </w:pPr>
+      <w:r>
+        <w:rPr>
+          <w:rFonts w:ascii="Times New Roman" w:hAnsi="Times New Roman" w:cs="Times New Roman" w:eastAsia="Times New Roman"/>
+          <w:sz w:val="28"/>
+        </w:rPr>
+        <w:t xml:space="preserve">Natijada quyidagi xulosaga kelish mumkin: milliy hisobot va MHXS 9 o‘rtasidagi farq sof barqaror moliyalashtirish me’yorini hisoblash usulida emas, balki unga kiritiladigan ma’lumotlarda namoyon bo‘ladi. Bu farq kapital yetarliligiga kuchli, sof barqaror moliyalashtirish me’yoriga esa ancha zaif ta’sir qiladi va unga asosiy ta’sir muammoli kreditlar tasnifi orqali o‘tadi. Shu sababli moliyaviy barqarorlikni integral baholashda milliy hisobot va MHXS ma’lumotlari o‘rtasidagi tafovut, eng avvalo, kapital va aktivlar sifati bloklarida, likvidlik blokida esa kamroq darajada hisobga olinishi lozim. O‘zbekistonda «yo‘l xaritasi»ga muvofiq aktivlarni tasniflash va zaxiralarni MHXS 9 ga moslashtirish 2026-yilning ikkinchi choragida yakunlanishi rejalashtirilgan bo‘lib</w:t>
+      </w:r>
+      <w:r>
+        <w:rPr>
+          <w:rStyle w:val="FootnoteReference"/>
+        </w:rPr>
+        <w:footnoteReference w:id="33"/>
+      </w:r>
+      <w:r>
+        <w:rPr>
+          <w:rFonts w:ascii="Times New Roman" w:hAnsi="Times New Roman" w:cs="Times New Roman" w:eastAsia="Times New Roman"/>
+          <w:sz w:val="28"/>
+        </w:rPr>
+        <w:t xml:space="preserve">, shundan so‘ng me’yorni hisoblashdagi muammoli kreditlar va zaxiralar ham MHXS 9 mantig‘iga yaqinlashadi. N.E. Sokolinskaya keltirgan misol bu farqning amaliy ko‘lamini yaqqol ko‘rsatadi: bir bank 2015-yilda milliy hisobotda 63,7 mlrd rubl zarar, MHXS bo‘yicha esa 4,35 mlrd rubl foyda ko‘rsatgan, MHXS 9 ga o‘tilganda esa zaxiralar kreditlarning 19,1 foiziga yetishi mumkin</w:t>
+      </w:r>
+      <w:r>
+        <w:rPr>
+          <w:rStyle w:val="FootnoteReference"/>
+        </w:rPr>
+        <w:footnoteReference w:id="34"/>
+      </w:r>
+      <w:r>
+        <w:rPr>
+          <w:rFonts w:ascii="Times New Roman" w:hAnsi="Times New Roman" w:cs="Times New Roman" w:eastAsia="Times New Roman"/>
+          <w:sz w:val="28"/>
+        </w:rPr>
+        <w:t xml:space="preserve">.</w:t>
+      </w:r>
+    </w:p>
+    <w:bookmarkEnd w:id="35"/>
     <w:sectPr>
       <w:pgMar w:left="1701" w:right="850" w:top="1134" w:bottom="1134"/>
     </w:sectPr>
@@ -2875,6 +3639,63 @@
       </w:r>
       <w:r>
         <w:t xml:space="preserve">Berdiyarov B.T. O‘zbekiston Respublikasi tijorat banklarining likvidliligi va to‘lov qobiliyatini ta’minlash masalalari: monografiya. – T.: Bank-moliya akademiyasi, 2020. – B. 27.</w:t>
+      </w:r>
+    </w:p>
+  </w:footnote>
+  <w:footnote w:id="32">
+    <w:p>
+      <w:pPr>
+        <w:pStyle w:val="FootnoteText"/>
+      </w:pPr>
+      <w:r>
+        <w:rPr>
+          <w:rStyle w:val="FootnoteReference"/>
+        </w:rPr>
+        <w:footnoteRef/>
+      </w:r>
+      <w:r>
+        <w:t xml:space="preserve"> </w:t>
+      </w:r>
+      <w:r>
+        <w:t xml:space="preserve">Tadqiqot natijasida muallif tomonidan shartli ma’lumotlar asosida ishlab chiqildi.</w:t>
+      </w:r>
+    </w:p>
+  </w:footnote>
+  <w:footnote w:id="33">
+    <w:p>
+      <w:pPr>
+        <w:pStyle w:val="FootnoteText"/>
+      </w:pPr>
+      <w:r>
+        <w:rPr>
+          <w:rStyle w:val="FootnoteReference"/>
+        </w:rPr>
+        <w:footnoteRef/>
+      </w:r>
+      <w:r>
+        <w:t xml:space="preserve"> </w:t>
+      </w:r>
+      <w:r>
+        <w:t xml:space="preserve">O‘zbekiston Respublikasi Markaziy banki. Moliya sektorini baholash dasturi (FSAP) tavsiyalarini amalga oshirish bo‘yicha 2025–2028-yillarga mo‘ljallangan «yo‘l xaritasi».</w:t>
+      </w:r>
+    </w:p>
+  </w:footnote>
+  <w:footnote w:id="34">
+    <w:p>
+      <w:pPr>
+        <w:pStyle w:val="FootnoteText"/>
+      </w:pPr>
+      <w:r>
+        <w:rPr>
+          <w:rStyle w:val="FootnoteReference"/>
+        </w:rPr>
+        <w:footnoteRef/>
+      </w:r>
+      <w:r>
+        <w:t xml:space="preserve"> </w:t>
+      </w:r>
+      <w:r>
+        <w:t xml:space="preserve">Соколинская Н.Э. Анализ и оценка финансового состояния коммерческого банка на основе МСФО. – М.: КНОРУС. – С. 85–87, 108.</w:t>
       </w:r>
     </w:p>
   </w:footnote>

</xml_diff>